<commit_message>
Update Git and GitHub documentation
</commit_message>
<xml_diff>
--- a/Git_and_GitHub_Documentation.docx
+++ b/Git_and_GitHub_Documentation.docx
@@ -87,6 +87,9 @@
         <w:t xml:space="preserve">Screenshot: </w:t>
       </w:r>
       <w:r>
+        <w:rPr>
+          <w:noProof/>
+        </w:rPr>
         <w:drawing>
           <wp:inline distT="0" distB="0" distL="0" distR="0" wp14:anchorId="7EA07285" wp14:editId="3907E491">
             <wp:extent cx="5486400" cy="2906395"/>
@@ -126,6 +129,9 @@
     </w:p>
     <w:p>
       <w:r>
+        <w:rPr>
+          <w:noProof/>
+        </w:rPr>
         <w:drawing>
           <wp:inline distT="0" distB="0" distL="0" distR="0" wp14:anchorId="7FF42D47" wp14:editId="419F9D02">
             <wp:extent cx="5486400" cy="960120"/>
@@ -215,6 +221,9 @@
         <w:t xml:space="preserve">Screenshot: </w:t>
       </w:r>
       <w:r>
+        <w:rPr>
+          <w:noProof/>
+        </w:rPr>
         <w:drawing>
           <wp:inline distT="0" distB="0" distL="0" distR="0" wp14:anchorId="450CAB31" wp14:editId="09D17599">
             <wp:extent cx="5486400" cy="2131060"/>
@@ -310,6 +319,9 @@
         <w:t xml:space="preserve">Screenshot: </w:t>
       </w:r>
       <w:r>
+        <w:rPr>
+          <w:noProof/>
+        </w:rPr>
         <w:drawing>
           <wp:inline distT="0" distB="0" distL="0" distR="0" wp14:anchorId="43324FE9" wp14:editId="4AF0D392">
             <wp:extent cx="5486400" cy="4681220"/>
@@ -440,6 +452,9 @@
         <w:t xml:space="preserve">: </w:t>
       </w:r>
       <w:r>
+        <w:rPr>
+          <w:noProof/>
+        </w:rPr>
         <w:drawing>
           <wp:inline distT="0" distB="0" distL="0" distR="0" wp14:anchorId="5B7D66AC" wp14:editId="70517447">
             <wp:extent cx="5486400" cy="2219960"/>
@@ -490,21 +505,111 @@
         <w:lastRenderedPageBreak/>
         <w:t>Command / Action:</w:t>
       </w:r>
+      <w:r>
+        <w:rPr>
+          <w:b/>
+        </w:rPr>
+        <w:t xml:space="preserve"> </w:t>
+      </w:r>
+      <w:r>
+        <w:t>git merge prashantmahor99</w:t>
+      </w:r>
+      <w:r>
+        <w:br/>
+        <w:t>git push origin main</w:t>
+      </w:r>
+    </w:p>
+    <w:p>
+      <w:r>
+        <w:rPr>
+          <w:b/>
+        </w:rPr>
+        <w:t xml:space="preserve">Explanation: </w:t>
+      </w:r>
+      <w:r>
+        <w:t>Merges the username branch into main and pushes the result.</w:t>
+      </w:r>
+    </w:p>
+    <w:p>
+      <w:pPr>
+        <w:rPr>
+          <w:b/>
+        </w:rPr>
+      </w:pPr>
+      <w:r>
+        <w:rPr>
+          <w:b/>
+        </w:rPr>
+        <w:t xml:space="preserve">Screenshot: </w:t>
+      </w:r>
+      <w:r>
+        <w:drawing>
+          <wp:inline distT="0" distB="0" distL="0" distR="0" wp14:anchorId="531DE615" wp14:editId="41F23255">
+            <wp:extent cx="5486400" cy="1258570"/>
+            <wp:effectExtent l="0" t="0" r="0" b="0"/>
+            <wp:docPr id="1764047758" name="Picture 1"/>
+            <wp:cNvGraphicFramePr>
+              <a:graphicFrameLocks xmlns:a="http://schemas.openxmlformats.org/drawingml/2006/main" noChangeAspect="1"/>
+            </wp:cNvGraphicFramePr>
+            <a:graphic xmlns:a="http://schemas.openxmlformats.org/drawingml/2006/main">
+              <a:graphicData uri="http://schemas.openxmlformats.org/drawingml/2006/picture">
+                <pic:pic xmlns:pic="http://schemas.openxmlformats.org/drawingml/2006/picture">
+                  <pic:nvPicPr>
+                    <pic:cNvPr id="1764047758" name=""/>
+                    <pic:cNvPicPr/>
+                  </pic:nvPicPr>
+                  <pic:blipFill>
+                    <a:blip r:embed="rId11"/>
+                    <a:stretch>
+                      <a:fillRect/>
+                    </a:stretch>
+                  </pic:blipFill>
+                  <pic:spPr>
+                    <a:xfrm>
+                      <a:off x="0" y="0"/>
+                      <a:ext cx="5486400" cy="1258570"/>
+                    </a:xfrm>
+                    <a:prstGeom prst="rect">
+                      <a:avLst/>
+                    </a:prstGeom>
+                  </pic:spPr>
+                </pic:pic>
+              </a:graphicData>
+            </a:graphic>
+          </wp:inline>
+        </w:drawing>
+      </w:r>
+    </w:p>
+    <w:p>
+      <w:pPr>
+        <w:pStyle w:val="Heading1"/>
+      </w:pPr>
+      <w:r>
+        <w:t>Task 2 - Update JSON &amp; Resolve Conflicts</w:t>
+      </w:r>
+    </w:p>
+    <w:p>
+      <w:pPr>
+        <w:pStyle w:val="Heading2"/>
+      </w:pPr>
+      <w:r>
+        <w:t>6. Create a new branch</w:t>
+      </w:r>
+    </w:p>
+    <w:p>
+      <w:r>
+        <w:rPr>
+          <w:b/>
+        </w:rPr>
+        <w:t>Command / Action:</w:t>
+      </w:r>
     </w:p>
     <w:p>
       <w:pPr>
         <w:pStyle w:val="NoSpacing"/>
       </w:pPr>
       <w:r>
-        <w:t>git checkout main</w:t>
-      </w:r>
-      <w:r>
-        <w:br/>
-        <w:t>git merge prashant</w:t>
-      </w:r>
-      <w:r>
-        <w:br/>
-        <w:t>git push origin main</w:t>
+        <w:t>git checkout -b prashant_new</w:t>
       </w:r>
     </w:p>
     <w:p>
@@ -515,7 +620,222 @@
         <w:t xml:space="preserve">Explanation: </w:t>
       </w:r>
       <w:r>
-        <w:t>Merges the username branch into main and pushes the result.</w:t>
+        <w:t>Creates the second working branch required by the assignment.</w:t>
+      </w:r>
+    </w:p>
+    <w:p>
+      <w:r>
+        <w:rPr>
+          <w:b/>
+        </w:rPr>
+        <w:t xml:space="preserve">Screenshot: </w:t>
+      </w:r>
+      <w:r>
+        <w:t>Paste your genuine terminal / GitHub / browser screenshot here.</w:t>
+      </w:r>
+    </w:p>
+    <w:p>
+      <w:pPr>
+        <w:pStyle w:val="Heading2"/>
+      </w:pPr>
+      <w:r>
+        <w:t>7. Update JSON used by /api</w:t>
+      </w:r>
+    </w:p>
+    <w:p>
+      <w:r>
+        <w:rPr>
+          <w:b/>
+        </w:rPr>
+        <w:t>Command / Action:</w:t>
+      </w:r>
+    </w:p>
+    <w:p>
+      <w:pPr>
+        <w:pStyle w:val="NoSpacing"/>
+      </w:pPr>
+      <w:r>
+        <w:t>Edit data/api_data.json</w:t>
+      </w:r>
+      <w:r>
+        <w:br/>
+        <w:t>git add data/api_data.json</w:t>
+      </w:r>
+      <w:r>
+        <w:br/>
+        <w:t>git commit -m "Update API JSON data"</w:t>
+      </w:r>
+    </w:p>
+    <w:p>
+      <w:r>
+        <w:rPr>
+          <w:b/>
+        </w:rPr>
+        <w:t xml:space="preserve">Explanation: </w:t>
+      </w:r>
+      <w:r>
+        <w:t>The Flask /api route reads this JSON file and returns it as a JSON response.</w:t>
+      </w:r>
+    </w:p>
+    <w:p>
+      <w:r>
+        <w:rPr>
+          <w:b/>
+        </w:rPr>
+        <w:t xml:space="preserve">Screenshot: </w:t>
+      </w:r>
+      <w:r>
+        <w:t>Paste your genuine terminal / GitHub / browser screenshot here.</w:t>
+      </w:r>
+    </w:p>
+    <w:p>
+      <w:pPr>
+        <w:pStyle w:val="Heading2"/>
+      </w:pPr>
+      <w:r>
+        <w:t>8. Merge the new branch into main</w:t>
+      </w:r>
+    </w:p>
+    <w:p>
+      <w:r>
+        <w:rPr>
+          <w:b/>
+        </w:rPr>
+        <w:t>Command / Action:</w:t>
+      </w:r>
+    </w:p>
+    <w:p>
+      <w:pPr>
+        <w:pStyle w:val="NoSpacing"/>
+      </w:pPr>
+      <w:r>
+        <w:t>git checkout main</w:t>
+      </w:r>
+      <w:r>
+        <w:br/>
+        <w:t>git merge prashant_new</w:t>
+      </w:r>
+    </w:p>
+    <w:p>
+      <w:r>
+        <w:rPr>
+          <w:b/>
+        </w:rPr>
+        <w:t xml:space="preserve">Explanation: </w:t>
+      </w:r>
+      <w:r>
+        <w:t>Merges the JSON change into main.</w:t>
+      </w:r>
+    </w:p>
+    <w:p>
+      <w:r>
+        <w:rPr>
+          <w:b/>
+        </w:rPr>
+        <w:t xml:space="preserve">Screenshot: </w:t>
+      </w:r>
+      <w:r>
+        <w:t>Paste your genuine terminal / GitHub / browser screenshot here.</w:t>
+      </w:r>
+    </w:p>
+    <w:p>
+      <w:pPr>
+        <w:pStyle w:val="Heading2"/>
+      </w:pPr>
+      <w:r>
+        <w:t>9. Resolve conflicts if present</w:t>
+      </w:r>
+    </w:p>
+    <w:p>
+      <w:r>
+        <w:rPr>
+          <w:b/>
+        </w:rPr>
+        <w:t>Command / Action:</w:t>
+      </w:r>
+    </w:p>
+    <w:p>
+      <w:pPr>
+        <w:pStyle w:val="NoSpacing"/>
+      </w:pPr>
+      <w:r>
+        <w:t>git status</w:t>
+      </w:r>
+      <w:r>
+        <w:br/>
+        <w:t># edit conflicted file</w:t>
+      </w:r>
+      <w:r>
+        <w:br/>
+      </w:r>
+      <w:r>
+        <w:lastRenderedPageBreak/>
+        <w:t>git add data/api_data.json</w:t>
+      </w:r>
+      <w:r>
+        <w:br/>
+        <w:t>git commit -m "Resolve JSON merge conflict"</w:t>
+      </w:r>
+    </w:p>
+    <w:p>
+      <w:r>
+        <w:rPr>
+          <w:b/>
+        </w:rPr>
+        <w:t xml:space="preserve">Explanation: </w:t>
+      </w:r>
+      <w:r>
+        <w:t>Accept the required changes, remove conflict markers, stage the resolved file and commit.</w:t>
+      </w:r>
+    </w:p>
+    <w:p>
+      <w:r>
+        <w:rPr>
+          <w:b/>
+        </w:rPr>
+        <w:t xml:space="preserve">Screenshot: </w:t>
+      </w:r>
+      <w:r>
+        <w:t>Paste your genuine terminal / GitHub / browser screenshot here.</w:t>
+      </w:r>
+    </w:p>
+    <w:p>
+      <w:pPr>
+        <w:pStyle w:val="Heading2"/>
+      </w:pPr>
+      <w:r>
+        <w:t>10. Push updates</w:t>
+      </w:r>
+    </w:p>
+    <w:p>
+      <w:r>
+        <w:rPr>
+          <w:b/>
+        </w:rPr>
+        <w:t>Command / Action:</w:t>
+      </w:r>
+    </w:p>
+    <w:p>
+      <w:pPr>
+        <w:pStyle w:val="NoSpacing"/>
+      </w:pPr>
+      <w:r>
+        <w:t>git push origin main</w:t>
+      </w:r>
+      <w:r>
+        <w:br/>
+        <w:t>git push origin prashant_new</w:t>
+      </w:r>
+    </w:p>
+    <w:p>
+      <w:r>
+        <w:rPr>
+          <w:b/>
+        </w:rPr>
+        <w:t xml:space="preserve">Explanation: </w:t>
+      </w:r>
+      <w:r>
+        <w:t>Uploads the updated main branch and working branch to GitHub.</w:t>
       </w:r>
     </w:p>
     <w:p>
@@ -534,7 +854,7 @@
         <w:pStyle w:val="Heading1"/>
       </w:pPr>
       <w:r>
-        <w:t>Task 2 - Update JSON &amp; Resolve Conflicts</w:t>
+        <w:t>Task 3 - Parallel Feature Development</w:t>
       </w:r>
     </w:p>
     <w:p>
@@ -542,7 +862,7 @@
         <w:pStyle w:val="Heading2"/>
       </w:pPr>
       <w:r>
-        <w:t>6. Create a new branch</w:t>
+        <w:t>11. Create master_1 and master_2 from main</w:t>
       </w:r>
     </w:p>
     <w:p>
@@ -558,7 +878,19 @@
         <w:pStyle w:val="NoSpacing"/>
       </w:pPr>
       <w:r>
-        <w:t>git checkout -b prashant_new</w:t>
+        <w:t>git checkout main</w:t>
+      </w:r>
+      <w:r>
+        <w:br/>
+        <w:t>git checkout -b master_1</w:t>
+      </w:r>
+      <w:r>
+        <w:br/>
+        <w:t>git checkout main</w:t>
+      </w:r>
+      <w:r>
+        <w:br/>
+        <w:t>git checkout -b master_2</w:t>
       </w:r>
     </w:p>
     <w:p>
@@ -569,7 +901,7 @@
         <w:t xml:space="preserve">Explanation: </w:t>
       </w:r>
       <w:r>
-        <w:t>Creates the second working branch required by the assignment.</w:t>
+        <w:t>Creates two parallel development branches from main.</w:t>
       </w:r>
     </w:p>
     <w:p>
@@ -588,7 +920,7 @@
         <w:pStyle w:val="Heading2"/>
       </w:pPr>
       <w:r>
-        <w:t>7. Update JSON used by /api</w:t>
+        <w:t>12. Frontend in master_1</w:t>
       </w:r>
     </w:p>
     <w:p>
@@ -604,15 +936,19 @@
         <w:pStyle w:val="NoSpacing"/>
       </w:pPr>
       <w:r>
-        <w:t>Edit data/api_data.json</w:t>
+        <w:t>git checkout master_1</w:t>
       </w:r>
       <w:r>
         <w:br/>
-        <w:t>git add data/api_data.json</w:t>
+        <w:t># edit templates/todo.html</w:t>
       </w:r>
       <w:r>
         <w:br/>
-        <w:t>git commit -m "Update API JSON data"</w:t>
+        <w:t>git add templates/todo.html static/style.css</w:t>
+      </w:r>
+      <w:r>
+        <w:br/>
+        <w:t>git commit -m "Add To-Do frontend form"</w:t>
       </w:r>
     </w:p>
     <w:p>
@@ -623,7 +959,7 @@
         <w:t xml:space="preserve">Explanation: </w:t>
       </w:r>
       <w:r>
-        <w:t>The Flask /api route reads this JSON file and returns it as a JSON response.</w:t>
+        <w:t>Build a To-Do form containing Item Name and Item Description.</w:t>
       </w:r>
     </w:p>
     <w:p>
@@ -642,7 +978,7 @@
         <w:pStyle w:val="Heading2"/>
       </w:pPr>
       <w:r>
-        <w:t>8. Merge the new branch into main</w:t>
+        <w:t>13. Backend in master_2</w:t>
       </w:r>
     </w:p>
     <w:p>
@@ -658,11 +994,19 @@
         <w:pStyle w:val="NoSpacing"/>
       </w:pPr>
       <w:r>
-        <w:t>git checkout main</w:t>
+        <w:t>git checkout master_2</w:t>
       </w:r>
       <w:r>
         <w:br/>
-        <w:t>git merge prashant_new</w:t>
+        <w:t># edit app.py</w:t>
+      </w:r>
+      <w:r>
+        <w:br/>
+        <w:t>git add app.py requirements.txt .env.example .gitignore</w:t>
+      </w:r>
+      <w:r>
+        <w:br/>
+        <w:t>git commit -m "Add submitto API and MongoDB storage"</w:t>
       </w:r>
     </w:p>
     <w:p>
@@ -673,7 +1017,7 @@
         <w:t xml:space="preserve">Explanation: </w:t>
       </w:r>
       <w:r>
-        <w:t>Merges the JSON change into main.</w:t>
+        <w:t>Adds POST /submitto and inserts submitted values into MongoDB Atlas.</w:t>
       </w:r>
     </w:p>
     <w:p>
@@ -681,6 +1025,7 @@
         <w:rPr>
           <w:b/>
         </w:rPr>
+        <w:lastRenderedPageBreak/>
         <w:t xml:space="preserve">Screenshot: </w:t>
       </w:r>
       <w:r>
@@ -692,7 +1037,7 @@
         <w:pStyle w:val="Heading2"/>
       </w:pPr>
       <w:r>
-        <w:t>9. Resolve conflicts if present</w:t>
+        <w:t>14. Merge both branches into main</w:t>
       </w:r>
     </w:p>
     <w:p>
@@ -708,19 +1053,19 @@
         <w:pStyle w:val="NoSpacing"/>
       </w:pPr>
       <w:r>
-        <w:t>git status</w:t>
+        <w:t>git checkout main</w:t>
       </w:r>
       <w:r>
         <w:br/>
-        <w:t># edit conflicted file</w:t>
+        <w:t>git merge master_1</w:t>
       </w:r>
       <w:r>
         <w:br/>
-        <w:t>git add data/api_data.json</w:t>
+        <w:t>git merge master_2</w:t>
       </w:r>
       <w:r>
         <w:br/>
-        <w:t>git commit -m "Resolve JSON merge conflict"</w:t>
+        <w:t>git push origin main</w:t>
       </w:r>
     </w:p>
     <w:p>
@@ -731,7 +1076,7 @@
         <w:t xml:space="preserve">Explanation: </w:t>
       </w:r>
       <w:r>
-        <w:t>Accept the required changes, remove conflict markers, stage the resolved file and commit.</w:t>
+        <w:t>Combines the parallel frontend and backend features.</w:t>
       </w:r>
     </w:p>
     <w:p>
@@ -743,6 +1088,14 @@
       </w:r>
       <w:r>
         <w:t>Paste your genuine terminal / GitHub / browser screenshot here.</w:t>
+      </w:r>
+    </w:p>
+    <w:p>
+      <w:pPr>
+        <w:pStyle w:val="Heading1"/>
+      </w:pPr>
+      <w:r>
+        <w:t>Task 4 - Sequential Commits, Reset &amp; Rebase</w:t>
       </w:r>
     </w:p>
     <w:p>
@@ -750,8 +1103,7 @@
         <w:pStyle w:val="Heading2"/>
       </w:pPr>
       <w:r>
-        <w:lastRenderedPageBreak/>
-        <w:t>10. Push updates</w:t>
+        <w:t>15. Add Item ID, UUID and Hash separately</w:t>
       </w:r>
     </w:p>
     <w:p>
@@ -767,11 +1119,43 @@
         <w:pStyle w:val="NoSpacing"/>
       </w:pPr>
       <w:r>
-        <w:t>git push origin main</w:t>
+        <w:t>git checkout master_1</w:t>
       </w:r>
       <w:r>
         <w:br/>
-        <w:t>git push origin prashant_new</w:t>
+        <w:t># add Item ID</w:t>
+      </w:r>
+      <w:r>
+        <w:br/>
+        <w:t>git add templates/todo.html</w:t>
+      </w:r>
+      <w:r>
+        <w:br/>
+        <w:t>git commit -m "Add Item ID field"</w:t>
+      </w:r>
+      <w:r>
+        <w:br/>
+        <w:t># add Item UUID</w:t>
+      </w:r>
+      <w:r>
+        <w:br/>
+        <w:t>git add templates/todo.html</w:t>
+      </w:r>
+      <w:r>
+        <w:br/>
+        <w:t>git commit -m "Add Item UUID field"</w:t>
+      </w:r>
+      <w:r>
+        <w:br/>
+        <w:t># add Item Hash</w:t>
+      </w:r>
+      <w:r>
+        <w:br/>
+        <w:t>git add templates/todo.html</w:t>
+      </w:r>
+      <w:r>
+        <w:br/>
+        <w:t>git commit -m "Add Item Hash field"</w:t>
       </w:r>
     </w:p>
     <w:p>
@@ -782,7 +1166,220 @@
         <w:t xml:space="preserve">Explanation: </w:t>
       </w:r>
       <w:r>
-        <w:t>Uploads the updated main branch and working branch to GitHub.</w:t>
+        <w:t>Each field must be committed separately so the history contains three individual commits.</w:t>
+      </w:r>
+    </w:p>
+    <w:p>
+      <w:r>
+        <w:rPr>
+          <w:b/>
+        </w:rPr>
+        <w:t xml:space="preserve">Screenshot: </w:t>
+      </w:r>
+      <w:r>
+        <w:t>Paste your genuine terminal / GitHub / browser screenshot here.</w:t>
+      </w:r>
+    </w:p>
+    <w:p>
+      <w:pPr>
+        <w:pStyle w:val="Heading2"/>
+      </w:pPr>
+      <w:r>
+        <w:t>16. Verify sequential commits</w:t>
+      </w:r>
+    </w:p>
+    <w:p>
+      <w:r>
+        <w:rPr>
+          <w:b/>
+        </w:rPr>
+        <w:t>Command / Action:</w:t>
+      </w:r>
+    </w:p>
+    <w:p>
+      <w:pPr>
+        <w:pStyle w:val="NoSpacing"/>
+      </w:pPr>
+      <w:r>
+        <w:t>git log --oneline -5</w:t>
+      </w:r>
+    </w:p>
+    <w:p>
+      <w:r>
+        <w:rPr>
+          <w:b/>
+        </w:rPr>
+        <w:t xml:space="preserve">Explanation: </w:t>
+      </w:r>
+      <w:r>
+        <w:t>Shows the three separate commits in history.</w:t>
+      </w:r>
+    </w:p>
+    <w:p>
+      <w:r>
+        <w:rPr>
+          <w:b/>
+        </w:rPr>
+        <w:t xml:space="preserve">Screenshot: </w:t>
+      </w:r>
+      <w:r>
+        <w:t>Paste your genuine terminal / GitHub / browser screenshot here.</w:t>
+      </w:r>
+    </w:p>
+    <w:p>
+      <w:pPr>
+        <w:pStyle w:val="Heading2"/>
+      </w:pPr>
+      <w:r>
+        <w:t>17. Merge master_1 into main</w:t>
+      </w:r>
+    </w:p>
+    <w:p>
+      <w:r>
+        <w:rPr>
+          <w:b/>
+        </w:rPr>
+        <w:t>Command / Action:</w:t>
+      </w:r>
+    </w:p>
+    <w:p>
+      <w:pPr>
+        <w:pStyle w:val="NoSpacing"/>
+      </w:pPr>
+      <w:r>
+        <w:t>git checkout main</w:t>
+      </w:r>
+      <w:r>
+        <w:br/>
+        <w:t>git merge master_1</w:t>
+      </w:r>
+    </w:p>
+    <w:p>
+      <w:r>
+        <w:rPr>
+          <w:b/>
+        </w:rPr>
+        <w:t xml:space="preserve">Explanation: </w:t>
+      </w:r>
+      <w:r>
+        <w:t>Brings the enhanced To-Do form into main.</w:t>
+      </w:r>
+    </w:p>
+    <w:p>
+      <w:r>
+        <w:rPr>
+          <w:b/>
+        </w:rPr>
+        <w:lastRenderedPageBreak/>
+        <w:t xml:space="preserve">Screenshot: </w:t>
+      </w:r>
+      <w:r>
+        <w:t>Paste your genuine terminal / GitHub / browser screenshot here.</w:t>
+      </w:r>
+    </w:p>
+    <w:p>
+      <w:pPr>
+        <w:pStyle w:val="Heading2"/>
+      </w:pPr>
+      <w:r>
+        <w:t>18. Soft reset and re-commit</w:t>
+      </w:r>
+    </w:p>
+    <w:p>
+      <w:r>
+        <w:rPr>
+          <w:b/>
+        </w:rPr>
+        <w:t>Command / Action:</w:t>
+      </w:r>
+    </w:p>
+    <w:p>
+      <w:pPr>
+        <w:pStyle w:val="NoSpacing"/>
+      </w:pPr>
+      <w:r>
+        <w:t>git log --oneline</w:t>
+      </w:r>
+      <w:r>
+        <w:br/>
+        <w:t>git reset --soft &lt;COMMIT_BEFORE_ITEM_ID&gt;</w:t>
+      </w:r>
+      <w:r>
+        <w:br/>
+        <w:t>git status</w:t>
+      </w:r>
+      <w:r>
+        <w:br/>
+        <w:t>git commit -m "Recommit To-Do enhancements after soft reset"</w:t>
+      </w:r>
+    </w:p>
+    <w:p>
+      <w:r>
+        <w:rPr>
+          <w:b/>
+        </w:rPr>
+        <w:t xml:space="preserve">Explanation: </w:t>
+      </w:r>
+      <w:r>
+        <w:t>Moves HEAD back while keeping changes staged, then creates a new commit and merges the work back into main as required.</w:t>
+      </w:r>
+    </w:p>
+    <w:p>
+      <w:r>
+        <w:rPr>
+          <w:b/>
+        </w:rPr>
+        <w:t xml:space="preserve">Screenshot: </w:t>
+      </w:r>
+      <w:r>
+        <w:t>Paste your genuine terminal / GitHub / browser screenshot here.</w:t>
+      </w:r>
+    </w:p>
+    <w:p>
+      <w:pPr>
+        <w:pStyle w:val="Heading2"/>
+      </w:pPr>
+      <w:r>
+        <w:t>19. Rebase main onto master_1</w:t>
+      </w:r>
+    </w:p>
+    <w:p>
+      <w:r>
+        <w:rPr>
+          <w:b/>
+        </w:rPr>
+        <w:t>Command / Action:</w:t>
+      </w:r>
+    </w:p>
+    <w:p>
+      <w:pPr>
+        <w:pStyle w:val="NoSpacing"/>
+      </w:pPr>
+      <w:r>
+        <w:t>git checkout master_1</w:t>
+      </w:r>
+      <w:r>
+        <w:br/>
+        <w:t>git rebase main</w:t>
+      </w:r>
+      <w:r>
+        <w:br/>
+        <w:t># assignment equivalent: git rebase main master_1</w:t>
+      </w:r>
+      <w:r>
+        <w:br/>
+        <w:t>git log --oneline --graph --decorate --all</w:t>
+      </w:r>
+    </w:p>
+    <w:p>
+      <w:r>
+        <w:rPr>
+          <w:b/>
+        </w:rPr>
+        <w:t xml:space="preserve">Explanation: </w:t>
+      </w:r>
+      <w:r>
+        <w:t>Replays master_1 on top of the updated main while preserving commit history and without squashing.</w:t>
       </w:r>
     </w:p>
     <w:p>
@@ -801,23 +1398,12 @@
         <w:pStyle w:val="Heading1"/>
       </w:pPr>
       <w:r>
-        <w:t>Task 3 - Parallel Feature Development</w:t>
+        <w:t>Flask Application Verification</w:t>
       </w:r>
     </w:p>
     <w:p>
-      <w:pPr>
-        <w:pStyle w:val="Heading2"/>
-      </w:pPr>
-      <w:r>
-        <w:t>11. Create master_1 and master_2 from main</w:t>
-      </w:r>
-    </w:p>
-    <w:p>
-      <w:r>
-        <w:rPr>
-          <w:b/>
-        </w:rPr>
-        <w:t>Command / Action:</w:t>
+      <w:r>
+        <w:t>Run the included application after configuring MongoDB Atlas:</w:t>
       </w:r>
     </w:p>
     <w:p>
@@ -825,57 +1411,49 @@
         <w:pStyle w:val="NoSpacing"/>
       </w:pPr>
       <w:r>
-        <w:t>git checkout main</w:t>
+        <w:t>python3 -m venv venv</w:t>
       </w:r>
       <w:r>
         <w:br/>
-        <w:t>git checkout -b master_1</w:t>
+        <w:t>source venv/bin/activate</w:t>
       </w:r>
       <w:r>
         <w:br/>
-        <w:t>git checkout main</w:t>
+        <w:t>pip install -r requirements.txt</w:t>
       </w:r>
       <w:r>
         <w:br/>
-        <w:t>git checkout -b master_2</w:t>
+        <w:t>cp .env.example .env</w:t>
+      </w:r>
+      <w:r>
+        <w:br/>
+        <w:t>python3 app.py</w:t>
       </w:r>
     </w:p>
     <w:p>
       <w:r>
-        <w:rPr>
-          <w:b/>
-        </w:rPr>
-        <w:t xml:space="preserve">Explanation: </w:t>
-      </w:r>
-      <w:r>
-        <w:t>Creates two parallel development branches from main.</w:t>
-      </w:r>
-    </w:p>
-    <w:p>
-      <w:r>
-        <w:rPr>
-          <w:b/>
-        </w:rPr>
-        <w:t xml:space="preserve">Screenshot: </w:t>
-      </w:r>
-      <w:r>
-        <w:t>Paste your genuine terminal / GitHub / browser screenshot here.</w:t>
+        <w:t>Verify http://127.0.0.1:5000/ and http://127.0.0.1:5000/api. Do not commit your real .env file or MongoDB password.</w:t>
       </w:r>
     </w:p>
     <w:p>
       <w:pPr>
-        <w:pStyle w:val="Heading2"/>
+        <w:pStyle w:val="Heading1"/>
       </w:pPr>
       <w:r>
-        <w:t>12. Frontend in master_1</w:t>
+        <w:t>GitHub Repository</w:t>
       </w:r>
     </w:p>
     <w:p>
       <w:r>
-        <w:rPr>
-          <w:b/>
-        </w:rPr>
-        <w:t>Command / Action:</w:t>
+        <w:t>Repository URL: _________________________________________________</w:t>
+      </w:r>
+    </w:p>
+    <w:p>
+      <w:pPr>
+        <w:pStyle w:val="Heading1"/>
+      </w:pPr>
+      <w:r>
+        <w:t>Final Verification Commands</w:t>
       </w:r>
     </w:p>
     <w:p>
@@ -883,158 +1461,15 @@
         <w:pStyle w:val="NoSpacing"/>
       </w:pPr>
       <w:r>
-        <w:t>git checkout master_1</w:t>
+        <w:t>git status</w:t>
       </w:r>
       <w:r>
         <w:br/>
-        <w:t># edit templates/todo.html</w:t>
+        <w:t>git branch</w:t>
       </w:r>
       <w:r>
         <w:br/>
-        <w:t>git add templates/todo.html static/style.css</w:t>
-      </w:r>
-      <w:r>
-        <w:br/>
-        <w:t>git commit -m "Add To-Do frontend form"</w:t>
-      </w:r>
-    </w:p>
-    <w:p>
-      <w:r>
-        <w:rPr>
-          <w:b/>
-        </w:rPr>
-        <w:t xml:space="preserve">Explanation: </w:t>
-      </w:r>
-      <w:r>
-        <w:t>Build a To-Do form containing Item Name and Item Description.</w:t>
-      </w:r>
-    </w:p>
-    <w:p>
-      <w:r>
-        <w:rPr>
-          <w:b/>
-        </w:rPr>
-        <w:t xml:space="preserve">Screenshot: </w:t>
-      </w:r>
-      <w:r>
-        <w:t>Paste your genuine terminal / GitHub / browser screenshot here.</w:t>
-      </w:r>
-    </w:p>
-    <w:p>
-      <w:pPr>
-        <w:pStyle w:val="Heading2"/>
-      </w:pPr>
-      <w:r>
-        <w:t>13. Backend in master_2</w:t>
-      </w:r>
-    </w:p>
-    <w:p>
-      <w:r>
-        <w:rPr>
-          <w:b/>
-        </w:rPr>
-        <w:t>Command / Action:</w:t>
-      </w:r>
-    </w:p>
-    <w:p>
-      <w:pPr>
-        <w:pStyle w:val="NoSpacing"/>
-      </w:pPr>
-      <w:r>
-        <w:t>git checkout master_2</w:t>
-      </w:r>
-      <w:r>
-        <w:br/>
-        <w:t># edit app.py</w:t>
-      </w:r>
-      <w:r>
-        <w:br/>
-        <w:t>git add app.py requirements.txt .env.example .gitignore</w:t>
-      </w:r>
-      <w:r>
-        <w:br/>
-        <w:t>git commit -m "Add submitto API and MongoDB storage"</w:t>
-      </w:r>
-    </w:p>
-    <w:p>
-      <w:r>
-        <w:rPr>
-          <w:b/>
-        </w:rPr>
-        <w:t xml:space="preserve">Explanation: </w:t>
-      </w:r>
-      <w:r>
-        <w:t>Adds POST /submitto and inserts submitted values into MongoDB Atlas.</w:t>
-      </w:r>
-    </w:p>
-    <w:p>
-      <w:r>
-        <w:rPr>
-          <w:b/>
-        </w:rPr>
-        <w:t xml:space="preserve">Screenshot: </w:t>
-      </w:r>
-      <w:r>
-        <w:t>Paste your genuine terminal / GitHub / browser screenshot here.</w:t>
-      </w:r>
-    </w:p>
-    <w:p>
-      <w:pPr>
-        <w:pStyle w:val="Heading2"/>
-      </w:pPr>
-      <w:r>
-        <w:t>14. Merge both branches into main</w:t>
-      </w:r>
-    </w:p>
-    <w:p>
-      <w:r>
-        <w:rPr>
-          <w:b/>
-        </w:rPr>
-        <w:t>Command / Action:</w:t>
-      </w:r>
-    </w:p>
-    <w:p>
-      <w:pPr>
-        <w:pStyle w:val="NoSpacing"/>
-      </w:pPr>
-      <w:r>
-        <w:lastRenderedPageBreak/>
-        <w:t>git checkout main</w:t>
-      </w:r>
-      <w:r>
-        <w:br/>
-        <w:t>git merge master_1</w:t>
-      </w:r>
-      <w:r>
-        <w:br/>
-        <w:t>git merge master_2</w:t>
-      </w:r>
-      <w:r>
-        <w:br/>
-        <w:t>git push origin main</w:t>
-      </w:r>
-    </w:p>
-    <w:p>
-      <w:r>
-        <w:rPr>
-          <w:b/>
-        </w:rPr>
-        <w:t xml:space="preserve">Explanation: </w:t>
-      </w:r>
-      <w:r>
-        <w:t>Combines the parallel frontend and backend features.</w:t>
-      </w:r>
-    </w:p>
-    <w:p>
-      <w:r>
-        <w:rPr>
-          <w:b/>
-        </w:rPr>
-        <w:t xml:space="preserve">Screenshot: </w:t>
-      </w:r>
-      <w:r>
-        <w:t>Paste your genuine terminal / GitHub / browser screenshot here.</w:t>
+        <w:t>git log --oneline --graph --decorate --all</w:t>
       </w:r>
     </w:p>
     <w:p>
@@ -1042,388 +1477,7 @@
         <w:pStyle w:val="Heading1"/>
       </w:pPr>
       <w:r>
-        <w:t>Task 4 - Sequential Commits, Reset &amp; Rebase</w:t>
-      </w:r>
-    </w:p>
-    <w:p>
-      <w:pPr>
-        <w:pStyle w:val="Heading2"/>
-      </w:pPr>
-      <w:r>
-        <w:t>15. Add Item ID, UUID and Hash separately</w:t>
-      </w:r>
-    </w:p>
-    <w:p>
-      <w:r>
-        <w:rPr>
-          <w:b/>
-        </w:rPr>
-        <w:t>Command / Action:</w:t>
-      </w:r>
-    </w:p>
-    <w:p>
-      <w:pPr>
-        <w:pStyle w:val="NoSpacing"/>
-      </w:pPr>
-      <w:r>
-        <w:t>git checkout master_1</w:t>
-      </w:r>
-      <w:r>
-        <w:br/>
-        <w:t># add Item ID</w:t>
-      </w:r>
-      <w:r>
-        <w:br/>
-        <w:t>git add templates/todo.html</w:t>
-      </w:r>
-      <w:r>
-        <w:br/>
-        <w:t>git commit -m "Add Item ID field"</w:t>
-      </w:r>
-      <w:r>
-        <w:br/>
-        <w:t># add Item UUID</w:t>
-      </w:r>
-      <w:r>
-        <w:br/>
-        <w:t>git add templates/todo.html</w:t>
-      </w:r>
-      <w:r>
-        <w:br/>
-        <w:t>git commit -m "Add Item UUID field"</w:t>
-      </w:r>
-      <w:r>
-        <w:br/>
-        <w:t># add Item Hash</w:t>
-      </w:r>
-      <w:r>
-        <w:br/>
-        <w:t>git add templates/todo.html</w:t>
-      </w:r>
-      <w:r>
-        <w:br/>
-        <w:t>git commit -m "Add Item Hash field"</w:t>
-      </w:r>
-    </w:p>
-    <w:p>
-      <w:r>
-        <w:rPr>
-          <w:b/>
-        </w:rPr>
-        <w:t xml:space="preserve">Explanation: </w:t>
-      </w:r>
-      <w:r>
-        <w:t>Each field must be committed separately so the history contains three individual commits.</w:t>
-      </w:r>
-    </w:p>
-    <w:p>
-      <w:r>
-        <w:rPr>
-          <w:b/>
-        </w:rPr>
-        <w:t xml:space="preserve">Screenshot: </w:t>
-      </w:r>
-      <w:r>
-        <w:t>Paste your genuine terminal / GitHub / browser screenshot here.</w:t>
-      </w:r>
-    </w:p>
-    <w:p>
-      <w:pPr>
-        <w:pStyle w:val="Heading2"/>
-      </w:pPr>
-      <w:r>
-        <w:t>16. Verify sequential commits</w:t>
-      </w:r>
-    </w:p>
-    <w:p>
-      <w:r>
-        <w:rPr>
-          <w:b/>
-        </w:rPr>
-        <w:t>Command / Action:</w:t>
-      </w:r>
-    </w:p>
-    <w:p>
-      <w:pPr>
-        <w:pStyle w:val="NoSpacing"/>
-      </w:pPr>
-      <w:r>
-        <w:t>git log --oneline -5</w:t>
-      </w:r>
-    </w:p>
-    <w:p>
-      <w:r>
-        <w:rPr>
-          <w:b/>
-        </w:rPr>
-        <w:t xml:space="preserve">Explanation: </w:t>
-      </w:r>
-      <w:r>
-        <w:t>Shows the three separate commits in history.</w:t>
-      </w:r>
-    </w:p>
-    <w:p>
-      <w:r>
-        <w:rPr>
-          <w:b/>
-        </w:rPr>
-        <w:t xml:space="preserve">Screenshot: </w:t>
-      </w:r>
-      <w:r>
-        <w:t>Paste your genuine terminal / GitHub / browser screenshot here.</w:t>
-      </w:r>
-    </w:p>
-    <w:p>
-      <w:pPr>
-        <w:pStyle w:val="Heading2"/>
-      </w:pPr>
-      <w:r>
-        <w:t>17. Merge master_1 into main</w:t>
-      </w:r>
-    </w:p>
-    <w:p>
-      <w:r>
-        <w:rPr>
-          <w:b/>
-        </w:rPr>
-        <w:t>Command / Action:</w:t>
-      </w:r>
-    </w:p>
-    <w:p>
-      <w:pPr>
-        <w:pStyle w:val="NoSpacing"/>
-      </w:pPr>
-      <w:r>
-        <w:t>git checkout main</w:t>
-      </w:r>
-      <w:r>
-        <w:br/>
-        <w:t>git merge master_1</w:t>
-      </w:r>
-    </w:p>
-    <w:p>
-      <w:r>
-        <w:rPr>
-          <w:b/>
-        </w:rPr>
-        <w:t xml:space="preserve">Explanation: </w:t>
-      </w:r>
-      <w:r>
-        <w:t>Brings the enhanced To-Do form into main.</w:t>
-      </w:r>
-    </w:p>
-    <w:p>
-      <w:r>
-        <w:rPr>
-          <w:b/>
-        </w:rPr>
-        <w:t xml:space="preserve">Screenshot: </w:t>
-      </w:r>
-      <w:r>
-        <w:t>Paste your genuine terminal / GitHub / browser screenshot here.</w:t>
-      </w:r>
-    </w:p>
-    <w:p>
-      <w:pPr>
-        <w:pStyle w:val="Heading2"/>
-      </w:pPr>
-      <w:r>
-        <w:t>18. Soft reset and re-commit</w:t>
-      </w:r>
-    </w:p>
-    <w:p>
-      <w:r>
-        <w:rPr>
-          <w:b/>
-        </w:rPr>
-        <w:t>Command / Action:</w:t>
-      </w:r>
-    </w:p>
-    <w:p>
-      <w:pPr>
-        <w:pStyle w:val="NoSpacing"/>
-      </w:pPr>
-      <w:r>
         <w:lastRenderedPageBreak/>
-        <w:t>git log --oneline</w:t>
-      </w:r>
-      <w:r>
-        <w:br/>
-        <w:t>git reset --soft &lt;COMMIT_BEFORE_ITEM_ID&gt;</w:t>
-      </w:r>
-      <w:r>
-        <w:br/>
-        <w:t>git status</w:t>
-      </w:r>
-      <w:r>
-        <w:br/>
-        <w:t>git commit -m "Recommit To-Do enhancements after soft reset"</w:t>
-      </w:r>
-    </w:p>
-    <w:p>
-      <w:r>
-        <w:rPr>
-          <w:b/>
-        </w:rPr>
-        <w:t xml:space="preserve">Explanation: </w:t>
-      </w:r>
-      <w:r>
-        <w:t>Moves HEAD back while keeping changes staged, then creates a new commit and merges the work back into main as required.</w:t>
-      </w:r>
-    </w:p>
-    <w:p>
-      <w:r>
-        <w:rPr>
-          <w:b/>
-        </w:rPr>
-        <w:t xml:space="preserve">Screenshot: </w:t>
-      </w:r>
-      <w:r>
-        <w:t>Paste your genuine terminal / GitHub / browser screenshot here.</w:t>
-      </w:r>
-    </w:p>
-    <w:p>
-      <w:pPr>
-        <w:pStyle w:val="Heading2"/>
-      </w:pPr>
-      <w:r>
-        <w:t>19. Rebase main onto master_1</w:t>
-      </w:r>
-    </w:p>
-    <w:p>
-      <w:r>
-        <w:rPr>
-          <w:b/>
-        </w:rPr>
-        <w:t>Command / Action:</w:t>
-      </w:r>
-    </w:p>
-    <w:p>
-      <w:pPr>
-        <w:pStyle w:val="NoSpacing"/>
-      </w:pPr>
-      <w:r>
-        <w:t>git checkout master_1</w:t>
-      </w:r>
-      <w:r>
-        <w:br/>
-        <w:t>git rebase main</w:t>
-      </w:r>
-      <w:r>
-        <w:br/>
-        <w:t># assignment equivalent: git rebase main master_1</w:t>
-      </w:r>
-      <w:r>
-        <w:br/>
-        <w:t>git log --oneline --graph --decorate --all</w:t>
-      </w:r>
-    </w:p>
-    <w:p>
-      <w:r>
-        <w:rPr>
-          <w:b/>
-        </w:rPr>
-        <w:t xml:space="preserve">Explanation: </w:t>
-      </w:r>
-      <w:r>
-        <w:t>Replays master_1 on top of the updated main while preserving commit history and without squashing.</w:t>
-      </w:r>
-    </w:p>
-    <w:p>
-      <w:r>
-        <w:rPr>
-          <w:b/>
-        </w:rPr>
-        <w:t xml:space="preserve">Screenshot: </w:t>
-      </w:r>
-      <w:r>
-        <w:t>Paste your genuine terminal / GitHub / browser screenshot here.</w:t>
-      </w:r>
-    </w:p>
-    <w:p>
-      <w:pPr>
-        <w:pStyle w:val="Heading1"/>
-      </w:pPr>
-      <w:r>
-        <w:t>Flask Application Verification</w:t>
-      </w:r>
-    </w:p>
-    <w:p>
-      <w:r>
-        <w:t>Run the included application after configuring MongoDB Atlas:</w:t>
-      </w:r>
-    </w:p>
-    <w:p>
-      <w:pPr>
-        <w:pStyle w:val="NoSpacing"/>
-      </w:pPr>
-      <w:r>
-        <w:t>python3 -m venv venv</w:t>
-      </w:r>
-      <w:r>
-        <w:br/>
-        <w:t>source venv/bin/activate</w:t>
-      </w:r>
-      <w:r>
-        <w:br/>
-        <w:t>pip install -r requirements.txt</w:t>
-      </w:r>
-      <w:r>
-        <w:br/>
-        <w:t>cp .env.example .env</w:t>
-      </w:r>
-      <w:r>
-        <w:br/>
-        <w:t>python3 app.py</w:t>
-      </w:r>
-    </w:p>
-    <w:p>
-      <w:r>
-        <w:t>Verify http://127.0.0.1:5000/ and http://127.0.0.1:5000/api. Do not commit your real .env file or MongoDB password.</w:t>
-      </w:r>
-    </w:p>
-    <w:p>
-      <w:pPr>
-        <w:pStyle w:val="Heading1"/>
-      </w:pPr>
-      <w:r>
-        <w:t>GitHub Repository</w:t>
-      </w:r>
-    </w:p>
-    <w:p>
-      <w:r>
-        <w:t>Repository URL: _________________________________________________</w:t>
-      </w:r>
-    </w:p>
-    <w:p>
-      <w:pPr>
-        <w:pStyle w:val="Heading1"/>
-      </w:pPr>
-      <w:r>
-        <w:t>Final Verification Commands</w:t>
-      </w:r>
-    </w:p>
-    <w:p>
-      <w:pPr>
-        <w:pStyle w:val="NoSpacing"/>
-      </w:pPr>
-      <w:r>
-        <w:t>git status</w:t>
-      </w:r>
-      <w:r>
-        <w:br/>
-        <w:t>git branch</w:t>
-      </w:r>
-      <w:r>
-        <w:br/>
-        <w:t>git log --oneline --graph --decorate --all</w:t>
-      </w:r>
-    </w:p>
-    <w:p>
-      <w:pPr>
-        <w:pStyle w:val="Heading1"/>
-      </w:pPr>
-      <w:r>
         <w:t>Submission Checklist</w:t>
       </w:r>
     </w:p>
@@ -1456,7 +1510,6 @@
         <w:pStyle w:val="ListBullet"/>
       </w:pPr>
       <w:r>
-        <w:lastRenderedPageBreak/>
         <w:t>GitHub repository URL added to this document.</w:t>
       </w:r>
     </w:p>

</xml_diff>

<commit_message>
working on the task 2
</commit_message>
<xml_diff>
--- a/Git_and_GitHub_Documentation.docx
+++ b/Git_and_GitHub_Documentation.docx
@@ -397,13 +397,8 @@
         <w:t xml:space="preserve"> </w:t>
       </w:r>
       <w:r>
-        <w:t xml:space="preserve">git </w:t>
-      </w:r>
-      <w:proofErr w:type="gramStart"/>
-      <w:r>
-        <w:t>add .</w:t>
-      </w:r>
-      <w:proofErr w:type="gramEnd"/>
+        <w:t>git add .</w:t>
+      </w:r>
       <w:r>
         <w:t xml:space="preserve">  , </w:t>
       </w:r>
@@ -433,7 +428,6 @@
         <w:t xml:space="preserve">Stages the complete project and creates the first feature </w:t>
       </w:r>
       <w:proofErr w:type="spellStart"/>
-      <w:proofErr w:type="gramStart"/>
       <w:r>
         <w:t>commit.</w:t>
       </w:r>
@@ -444,7 +438,6 @@
         <w:t>Screenshot</w:t>
       </w:r>
       <w:proofErr w:type="spellEnd"/>
-      <w:proofErr w:type="gramEnd"/>
       <w:r>
         <w:rPr>
           <w:b/>
@@ -543,6 +536,9 @@
         <w:t xml:space="preserve">Screenshot: </w:t>
       </w:r>
       <w:r>
+        <w:rPr>
+          <w:noProof/>
+        </w:rPr>
         <w:drawing>
           <wp:inline distT="0" distB="0" distL="0" distR="0" wp14:anchorId="531DE615" wp14:editId="41F23255">
             <wp:extent cx="5486400" cy="1258570"/>
@@ -591,8 +587,24 @@
     <w:p>
       <w:pPr>
         <w:pStyle w:val="Heading2"/>
+        <w:rPr>
+          <w:rFonts w:ascii="Arial" w:eastAsiaTheme="minorEastAsia" w:hAnsi="Arial" w:cstheme="minorBidi"/>
+          <w:b w:val="0"/>
+          <w:bCs w:val="0"/>
+          <w:color w:val="auto"/>
+          <w:sz w:val="21"/>
+          <w:szCs w:val="22"/>
+        </w:rPr>
       </w:pPr>
       <w:r>
+        <w:rPr>
+          <w:rFonts w:ascii="Arial" w:eastAsiaTheme="minorEastAsia" w:hAnsi="Arial" w:cstheme="minorBidi"/>
+          <w:b w:val="0"/>
+          <w:bCs w:val="0"/>
+          <w:color w:val="auto"/>
+          <w:sz w:val="21"/>
+          <w:szCs w:val="22"/>
+        </w:rPr>
         <w:t>6. Create a new branch</w:t>
       </w:r>
     </w:p>
@@ -624,6 +636,205 @@
       </w:r>
     </w:p>
     <w:p>
+      <w:pPr>
+        <w:rPr>
+          <w:b/>
+        </w:rPr>
+      </w:pPr>
+      <w:r>
+        <w:rPr>
+          <w:b/>
+        </w:rPr>
+        <w:t xml:space="preserve">Screenshot: </w:t>
+      </w:r>
+      <w:r>
+        <w:drawing>
+          <wp:inline distT="0" distB="0" distL="0" distR="0" wp14:anchorId="1A350790" wp14:editId="202CAD3F">
+            <wp:extent cx="5486400" cy="3702685"/>
+            <wp:effectExtent l="0" t="0" r="0" b="0"/>
+            <wp:docPr id="538779616" name="Picture 1"/>
+            <wp:cNvGraphicFramePr>
+              <a:graphicFrameLocks xmlns:a="http://schemas.openxmlformats.org/drawingml/2006/main" noChangeAspect="1"/>
+            </wp:cNvGraphicFramePr>
+            <a:graphic xmlns:a="http://schemas.openxmlformats.org/drawingml/2006/main">
+              <a:graphicData uri="http://schemas.openxmlformats.org/drawingml/2006/picture">
+                <pic:pic xmlns:pic="http://schemas.openxmlformats.org/drawingml/2006/picture">
+                  <pic:nvPicPr>
+                    <pic:cNvPr id="538779616" name=""/>
+                    <pic:cNvPicPr/>
+                  </pic:nvPicPr>
+                  <pic:blipFill>
+                    <a:blip r:embed="rId12"/>
+                    <a:stretch>
+                      <a:fillRect/>
+                    </a:stretch>
+                  </pic:blipFill>
+                  <pic:spPr>
+                    <a:xfrm>
+                      <a:off x="0" y="0"/>
+                      <a:ext cx="5486400" cy="3702685"/>
+                    </a:xfrm>
+                    <a:prstGeom prst="rect">
+                      <a:avLst/>
+                    </a:prstGeom>
+                  </pic:spPr>
+                </pic:pic>
+              </a:graphicData>
+            </a:graphic>
+          </wp:inline>
+        </w:drawing>
+      </w:r>
+    </w:p>
+    <w:p>
+      <w:r>
+        <w:t>7. Update JSON used by /api</w:t>
+      </w:r>
+    </w:p>
+    <w:p>
+      <w:r>
+        <w:rPr>
+          <w:b/>
+        </w:rPr>
+        <w:lastRenderedPageBreak/>
+        <w:t>Command / Action:</w:t>
+      </w:r>
+    </w:p>
+    <w:p>
+      <w:pPr>
+        <w:pStyle w:val="NoSpacing"/>
+      </w:pPr>
+      <w:r>
+        <w:t>notepad</w:t>
+      </w:r>
+      <w:r>
+        <w:t xml:space="preserve"> </w:t>
+      </w:r>
+      <w:r>
+        <w:t>.\</w:t>
+      </w:r>
+      <w:r>
+        <w:t>data</w:t>
+      </w:r>
+      <w:r>
+        <w:t>\</w:t>
+      </w:r>
+      <w:proofErr w:type="spellStart"/>
+      <w:r>
+        <w:t>api_data.json</w:t>
+      </w:r>
+      <w:proofErr w:type="spellEnd"/>
+      <w:r>
+        <w:br/>
+        <w:t>git commit -m "</w:t>
+      </w:r>
+      <w:proofErr w:type="spellStart"/>
+      <w:r>
+        <w:t>json</w:t>
+      </w:r>
+      <w:proofErr w:type="spellEnd"/>
+      <w:r>
+        <w:t xml:space="preserve"> update</w:t>
+      </w:r>
+      <w:r>
+        <w:t>"</w:t>
+      </w:r>
+    </w:p>
+    <w:p>
+      <w:pPr>
+        <w:pStyle w:val="NoSpacing"/>
+      </w:pPr>
+    </w:p>
+    <w:p>
+      <w:r>
+        <w:rPr>
+          <w:b/>
+        </w:rPr>
+        <w:t xml:space="preserve">Explanation: </w:t>
+      </w:r>
+      <w:r>
+        <w:t>The Flask /api route reads this JSON file and returns it as a JSON response.</w:t>
+      </w:r>
+    </w:p>
+    <w:p>
+      <w:r>
+        <w:rPr>
+          <w:b/>
+        </w:rPr>
+        <w:t xml:space="preserve">Screenshot: </w:t>
+      </w:r>
+      <w:r>
+        <w:drawing>
+          <wp:inline distT="0" distB="0" distL="0" distR="0" wp14:anchorId="788B1C6F" wp14:editId="0C839689">
+            <wp:extent cx="5486400" cy="3923665"/>
+            <wp:effectExtent l="0" t="0" r="0" b="635"/>
+            <wp:docPr id="405436287" name="Picture 1"/>
+            <wp:cNvGraphicFramePr>
+              <a:graphicFrameLocks xmlns:a="http://schemas.openxmlformats.org/drawingml/2006/main" noChangeAspect="1"/>
+            </wp:cNvGraphicFramePr>
+            <a:graphic xmlns:a="http://schemas.openxmlformats.org/drawingml/2006/main">
+              <a:graphicData uri="http://schemas.openxmlformats.org/drawingml/2006/picture">
+                <pic:pic xmlns:pic="http://schemas.openxmlformats.org/drawingml/2006/picture">
+                  <pic:nvPicPr>
+                    <pic:cNvPr id="405436287" name=""/>
+                    <pic:cNvPicPr/>
+                  </pic:nvPicPr>
+                  <pic:blipFill>
+                    <a:blip r:embed="rId13"/>
+                    <a:stretch>
+                      <a:fillRect/>
+                    </a:stretch>
+                  </pic:blipFill>
+                  <pic:spPr>
+                    <a:xfrm>
+                      <a:off x="0" y="0"/>
+                      <a:ext cx="5486400" cy="3923665"/>
+                    </a:xfrm>
+                    <a:prstGeom prst="rect">
+                      <a:avLst/>
+                    </a:prstGeom>
+                  </pic:spPr>
+                </pic:pic>
+              </a:graphicData>
+            </a:graphic>
+          </wp:inline>
+        </w:drawing>
+      </w:r>
+      <w:r>
+        <w:t>8. Merge the new branch into main</w:t>
+      </w:r>
+    </w:p>
+    <w:p>
+      <w:r>
+        <w:rPr>
+          <w:b/>
+        </w:rPr>
+        <w:t>Command / Action:</w:t>
+      </w:r>
+    </w:p>
+    <w:p>
+      <w:pPr>
+        <w:pStyle w:val="NoSpacing"/>
+      </w:pPr>
+      <w:r>
+        <w:t>git checkout main</w:t>
+      </w:r>
+      <w:r>
+        <w:br/>
+        <w:t>git merge prashant_new</w:t>
+      </w:r>
+    </w:p>
+    <w:p>
+      <w:r>
+        <w:rPr>
+          <w:b/>
+        </w:rPr>
+        <w:t xml:space="preserve">Explanation: </w:t>
+      </w:r>
+      <w:r>
+        <w:t>Merges the JSON change into main.</w:t>
+      </w:r>
+    </w:p>
+    <w:p>
       <w:r>
         <w:rPr>
           <w:b/>
@@ -639,7 +850,7 @@
         <w:pStyle w:val="Heading2"/>
       </w:pPr>
       <w:r>
-        <w:t>7. Update JSON used by /api</w:t>
+        <w:t>9. Resolve conflicts if present</w:t>
       </w:r>
     </w:p>
     <w:p>
@@ -655,7 +866,11 @@
         <w:pStyle w:val="NoSpacing"/>
       </w:pPr>
       <w:r>
-        <w:t>Edit data/api_data.json</w:t>
+        <w:t>git status</w:t>
+      </w:r>
+      <w:r>
+        <w:br/>
+        <w:t># edit conflicted file</w:t>
       </w:r>
       <w:r>
         <w:br/>
@@ -663,7 +878,7 @@
       </w:r>
       <w:r>
         <w:br/>
-        <w:t>git commit -m "Update API JSON data"</w:t>
+        <w:t>git commit -m "Resolve JSON merge conflict"</w:t>
       </w:r>
     </w:p>
     <w:p>
@@ -671,10 +886,11 @@
         <w:rPr>
           <w:b/>
         </w:rPr>
+        <w:lastRenderedPageBreak/>
         <w:t xml:space="preserve">Explanation: </w:t>
       </w:r>
       <w:r>
-        <w:t>The Flask /api route reads this JSON file and returns it as a JSON response.</w:t>
+        <w:t>Accept the required changes, remove conflict markers, stage the resolved file and commit.</w:t>
       </w:r>
     </w:p>
     <w:p>
@@ -693,7 +909,7 @@
         <w:pStyle w:val="Heading2"/>
       </w:pPr>
       <w:r>
-        <w:t>8. Merge the new branch into main</w:t>
+        <w:t>10. Push updates</w:t>
       </w:r>
     </w:p>
     <w:p>
@@ -709,11 +925,11 @@
         <w:pStyle w:val="NoSpacing"/>
       </w:pPr>
       <w:r>
-        <w:t>git checkout main</w:t>
+        <w:t>git push origin main</w:t>
       </w:r>
       <w:r>
         <w:br/>
-        <w:t>git merge prashant_new</w:t>
+        <w:t>git push origin prashant_new</w:t>
       </w:r>
     </w:p>
     <w:p>
@@ -724,7 +940,7 @@
         <w:t xml:space="preserve">Explanation: </w:t>
       </w:r>
       <w:r>
-        <w:t>Merges the JSON change into main.</w:t>
+        <w:t>Uploads the updated main branch and working branch to GitHub.</w:t>
       </w:r>
     </w:p>
     <w:p>
@@ -736,6 +952,14 @@
       </w:r>
       <w:r>
         <w:t>Paste your genuine terminal / GitHub / browser screenshot here.</w:t>
+      </w:r>
+    </w:p>
+    <w:p>
+      <w:pPr>
+        <w:pStyle w:val="Heading1"/>
+      </w:pPr>
+      <w:r>
+        <w:t>Task 3 - Parallel Feature Development</w:t>
       </w:r>
     </w:p>
     <w:p>
@@ -743,7 +967,7 @@
         <w:pStyle w:val="Heading2"/>
       </w:pPr>
       <w:r>
-        <w:t>9. Resolve conflicts if present</w:t>
+        <w:t>11. Create master_1 and master_2 from main</w:t>
       </w:r>
     </w:p>
     <w:p>
@@ -759,22 +983,19 @@
         <w:pStyle w:val="NoSpacing"/>
       </w:pPr>
       <w:r>
-        <w:t>git status</w:t>
+        <w:t>git checkout main</w:t>
       </w:r>
       <w:r>
         <w:br/>
-        <w:t># edit conflicted file</w:t>
+        <w:t>git checkout -b master_1</w:t>
       </w:r>
       <w:r>
         <w:br/>
-      </w:r>
-      <w:r>
-        <w:lastRenderedPageBreak/>
-        <w:t>git add data/api_data.json</w:t>
+        <w:t>git checkout main</w:t>
       </w:r>
       <w:r>
         <w:br/>
-        <w:t>git commit -m "Resolve JSON merge conflict"</w:t>
+        <w:t>git checkout -b master_2</w:t>
       </w:r>
     </w:p>
     <w:p>
@@ -785,7 +1006,7 @@
         <w:t xml:space="preserve">Explanation: </w:t>
       </w:r>
       <w:r>
-        <w:t>Accept the required changes, remove conflict markers, stage the resolved file and commit.</w:t>
+        <w:t>Creates two parallel development branches from main.</w:t>
       </w:r>
     </w:p>
     <w:p>
@@ -804,7 +1025,7 @@
         <w:pStyle w:val="Heading2"/>
       </w:pPr>
       <w:r>
-        <w:t>10. Push updates</w:t>
+        <w:t>12. Frontend in master_1</w:t>
       </w:r>
     </w:p>
     <w:p>
@@ -820,11 +1041,19 @@
         <w:pStyle w:val="NoSpacing"/>
       </w:pPr>
       <w:r>
-        <w:t>git push origin main</w:t>
+        <w:t>git checkout master_1</w:t>
       </w:r>
       <w:r>
         <w:br/>
-        <w:t>git push origin prashant_new</w:t>
+        <w:t># edit templates/todo.html</w:t>
+      </w:r>
+      <w:r>
+        <w:br/>
+        <w:t>git add templates/todo.html static/style.css</w:t>
+      </w:r>
+      <w:r>
+        <w:br/>
+        <w:t>git commit -m "Add To-Do frontend form"</w:t>
       </w:r>
     </w:p>
     <w:p>
@@ -835,7 +1064,124 @@
         <w:t xml:space="preserve">Explanation: </w:t>
       </w:r>
       <w:r>
-        <w:t>Uploads the updated main branch and working branch to GitHub.</w:t>
+        <w:t>Build a To-Do form containing Item Name and Item Description.</w:t>
+      </w:r>
+    </w:p>
+    <w:p>
+      <w:r>
+        <w:rPr>
+          <w:b/>
+        </w:rPr>
+        <w:t xml:space="preserve">Screenshot: </w:t>
+      </w:r>
+      <w:r>
+        <w:t>Paste your genuine terminal / GitHub / browser screenshot here.</w:t>
+      </w:r>
+    </w:p>
+    <w:p>
+      <w:pPr>
+        <w:pStyle w:val="Heading2"/>
+      </w:pPr>
+      <w:r>
+        <w:t>13. Backend in master_2</w:t>
+      </w:r>
+    </w:p>
+    <w:p>
+      <w:r>
+        <w:rPr>
+          <w:b/>
+        </w:rPr>
+        <w:t>Command / Action:</w:t>
+      </w:r>
+    </w:p>
+    <w:p>
+      <w:pPr>
+        <w:pStyle w:val="NoSpacing"/>
+      </w:pPr>
+      <w:r>
+        <w:t>git checkout master_2</w:t>
+      </w:r>
+      <w:r>
+        <w:br/>
+        <w:t># edit app.py</w:t>
+      </w:r>
+      <w:r>
+        <w:br/>
+        <w:t>git add app.py requirements.txt .env.example .gitignore</w:t>
+      </w:r>
+      <w:r>
+        <w:br/>
+        <w:t>git commit -m "Add submitto API and MongoDB storage"</w:t>
+      </w:r>
+    </w:p>
+    <w:p>
+      <w:r>
+        <w:rPr>
+          <w:b/>
+        </w:rPr>
+        <w:t xml:space="preserve">Explanation: </w:t>
+      </w:r>
+      <w:r>
+        <w:t>Adds POST /submitto and inserts submitted values into MongoDB Atlas.</w:t>
+      </w:r>
+    </w:p>
+    <w:p>
+      <w:r>
+        <w:rPr>
+          <w:b/>
+        </w:rPr>
+        <w:t xml:space="preserve">Screenshot: </w:t>
+      </w:r>
+      <w:r>
+        <w:t>Paste your genuine terminal / GitHub / browser screenshot here.</w:t>
+      </w:r>
+    </w:p>
+    <w:p>
+      <w:pPr>
+        <w:pStyle w:val="Heading2"/>
+      </w:pPr>
+      <w:r>
+        <w:lastRenderedPageBreak/>
+        <w:t>14. Merge both branches into main</w:t>
+      </w:r>
+    </w:p>
+    <w:p>
+      <w:r>
+        <w:rPr>
+          <w:b/>
+        </w:rPr>
+        <w:t>Command / Action:</w:t>
+      </w:r>
+    </w:p>
+    <w:p>
+      <w:pPr>
+        <w:pStyle w:val="NoSpacing"/>
+      </w:pPr>
+      <w:r>
+        <w:t>git checkout main</w:t>
+      </w:r>
+      <w:r>
+        <w:br/>
+        <w:t>git merge master_1</w:t>
+      </w:r>
+      <w:r>
+        <w:br/>
+        <w:t>git merge master_2</w:t>
+      </w:r>
+      <w:r>
+        <w:br/>
+        <w:t>git push origin main</w:t>
+      </w:r>
+    </w:p>
+    <w:p>
+      <w:r>
+        <w:rPr>
+          <w:b/>
+        </w:rPr>
+        <w:t xml:space="preserve">Explanation: </w:t>
+      </w:r>
+      <w:r>
+        <w:t>Combines the parallel frontend and backend features.</w:t>
       </w:r>
     </w:p>
     <w:p>
@@ -854,7 +1200,7 @@
         <w:pStyle w:val="Heading1"/>
       </w:pPr>
       <w:r>
-        <w:t>Task 3 - Parallel Feature Development</w:t>
+        <w:t>Task 4 - Sequential Commits, Reset &amp; Rebase</w:t>
       </w:r>
     </w:p>
     <w:p>
@@ -862,7 +1208,7 @@
         <w:pStyle w:val="Heading2"/>
       </w:pPr>
       <w:r>
-        <w:t>11. Create master_1 and master_2 from main</w:t>
+        <w:t>15. Add Item ID, UUID and Hash separately</w:t>
       </w:r>
     </w:p>
     <w:p>
@@ -878,19 +1224,43 @@
         <w:pStyle w:val="NoSpacing"/>
       </w:pPr>
       <w:r>
-        <w:t>git checkout main</w:t>
+        <w:t>git checkout master_1</w:t>
       </w:r>
       <w:r>
         <w:br/>
-        <w:t>git checkout -b master_1</w:t>
+        <w:t># add Item ID</w:t>
       </w:r>
       <w:r>
         <w:br/>
-        <w:t>git checkout main</w:t>
+        <w:t>git add templates/todo.html</w:t>
       </w:r>
       <w:r>
         <w:br/>
-        <w:t>git checkout -b master_2</w:t>
+        <w:t>git commit -m "Add Item ID field"</w:t>
+      </w:r>
+      <w:r>
+        <w:br/>
+        <w:t># add Item UUID</w:t>
+      </w:r>
+      <w:r>
+        <w:br/>
+        <w:t>git add templates/todo.html</w:t>
+      </w:r>
+      <w:r>
+        <w:br/>
+        <w:t>git commit -m "Add Item UUID field"</w:t>
+      </w:r>
+      <w:r>
+        <w:br/>
+        <w:t># add Item Hash</w:t>
+      </w:r>
+      <w:r>
+        <w:br/>
+        <w:t>git add templates/todo.html</w:t>
+      </w:r>
+      <w:r>
+        <w:br/>
+        <w:t>git commit -m "Add Item Hash field"</w:t>
       </w:r>
     </w:p>
     <w:p>
@@ -901,7 +1271,7 @@
         <w:t xml:space="preserve">Explanation: </w:t>
       </w:r>
       <w:r>
-        <w:t>Creates two parallel development branches from main.</w:t>
+        <w:t>Each field must be committed separately so the history contains three individual commits.</w:t>
       </w:r>
     </w:p>
     <w:p>
@@ -920,7 +1290,7 @@
         <w:pStyle w:val="Heading2"/>
       </w:pPr>
       <w:r>
-        <w:t>12. Frontend in master_1</w:t>
+        <w:t>16. Verify sequential commits</w:t>
       </w:r>
     </w:p>
     <w:p>
@@ -936,19 +1306,7 @@
         <w:pStyle w:val="NoSpacing"/>
       </w:pPr>
       <w:r>
-        <w:t>git checkout master_1</w:t>
-      </w:r>
-      <w:r>
-        <w:br/>
-        <w:t># edit templates/todo.html</w:t>
-      </w:r>
-      <w:r>
-        <w:br/>
-        <w:t>git add templates/todo.html static/style.css</w:t>
-      </w:r>
-      <w:r>
-        <w:br/>
-        <w:t>git commit -m "Add To-Do frontend form"</w:t>
+        <w:t>git log --oneline -5</w:t>
       </w:r>
     </w:p>
     <w:p>
@@ -959,7 +1317,7 @@
         <w:t xml:space="preserve">Explanation: </w:t>
       </w:r>
       <w:r>
-        <w:t>Build a To-Do form containing Item Name and Item Description.</w:t>
+        <w:t>Shows the three separate commits in history.</w:t>
       </w:r>
     </w:p>
     <w:p>
@@ -978,7 +1336,7 @@
         <w:pStyle w:val="Heading2"/>
       </w:pPr>
       <w:r>
-        <w:t>13. Backend in master_2</w:t>
+        <w:t>17. Merge master_1 into main</w:t>
       </w:r>
     </w:p>
     <w:p>
@@ -994,19 +1352,11 @@
         <w:pStyle w:val="NoSpacing"/>
       </w:pPr>
       <w:r>
-        <w:t>git checkout master_2</w:t>
+        <w:t>git checkout main</w:t>
       </w:r>
       <w:r>
         <w:br/>
-        <w:t># edit app.py</w:t>
-      </w:r>
-      <w:r>
-        <w:br/>
-        <w:t>git add app.py requirements.txt .env.example .gitignore</w:t>
-      </w:r>
-      <w:r>
-        <w:br/>
-        <w:t>git commit -m "Add submitto API and MongoDB storage"</w:t>
+        <w:t>git merge master_1</w:t>
       </w:r>
     </w:p>
     <w:p>
@@ -1017,7 +1367,7 @@
         <w:t xml:space="preserve">Explanation: </w:t>
       </w:r>
       <w:r>
-        <w:t>Adds POST /submitto and inserts submitted values into MongoDB Atlas.</w:t>
+        <w:t>Brings the enhanced To-Do form into main.</w:t>
       </w:r>
     </w:p>
     <w:p>
@@ -1025,7 +1375,6 @@
         <w:rPr>
           <w:b/>
         </w:rPr>
-        <w:lastRenderedPageBreak/>
         <w:t xml:space="preserve">Screenshot: </w:t>
       </w:r>
       <w:r>
@@ -1037,251 +1386,7 @@
         <w:pStyle w:val="Heading2"/>
       </w:pPr>
       <w:r>
-        <w:t>14. Merge both branches into main</w:t>
-      </w:r>
-    </w:p>
-    <w:p>
-      <w:r>
-        <w:rPr>
-          <w:b/>
-        </w:rPr>
-        <w:t>Command / Action:</w:t>
-      </w:r>
-    </w:p>
-    <w:p>
-      <w:pPr>
-        <w:pStyle w:val="NoSpacing"/>
-      </w:pPr>
-      <w:r>
-        <w:t>git checkout main</w:t>
-      </w:r>
-      <w:r>
-        <w:br/>
-        <w:t>git merge master_1</w:t>
-      </w:r>
-      <w:r>
-        <w:br/>
-        <w:t>git merge master_2</w:t>
-      </w:r>
-      <w:r>
-        <w:br/>
-        <w:t>git push origin main</w:t>
-      </w:r>
-    </w:p>
-    <w:p>
-      <w:r>
-        <w:rPr>
-          <w:b/>
-        </w:rPr>
-        <w:t xml:space="preserve">Explanation: </w:t>
-      </w:r>
-      <w:r>
-        <w:t>Combines the parallel frontend and backend features.</w:t>
-      </w:r>
-    </w:p>
-    <w:p>
-      <w:r>
-        <w:rPr>
-          <w:b/>
-        </w:rPr>
-        <w:t xml:space="preserve">Screenshot: </w:t>
-      </w:r>
-      <w:r>
-        <w:t>Paste your genuine terminal / GitHub / browser screenshot here.</w:t>
-      </w:r>
-    </w:p>
-    <w:p>
-      <w:pPr>
-        <w:pStyle w:val="Heading1"/>
-      </w:pPr>
-      <w:r>
-        <w:t>Task 4 - Sequential Commits, Reset &amp; Rebase</w:t>
-      </w:r>
-    </w:p>
-    <w:p>
-      <w:pPr>
-        <w:pStyle w:val="Heading2"/>
-      </w:pPr>
-      <w:r>
-        <w:t>15. Add Item ID, UUID and Hash separately</w:t>
-      </w:r>
-    </w:p>
-    <w:p>
-      <w:r>
-        <w:rPr>
-          <w:b/>
-        </w:rPr>
-        <w:t>Command / Action:</w:t>
-      </w:r>
-    </w:p>
-    <w:p>
-      <w:pPr>
-        <w:pStyle w:val="NoSpacing"/>
-      </w:pPr>
-      <w:r>
-        <w:t>git checkout master_1</w:t>
-      </w:r>
-      <w:r>
-        <w:br/>
-        <w:t># add Item ID</w:t>
-      </w:r>
-      <w:r>
-        <w:br/>
-        <w:t>git add templates/todo.html</w:t>
-      </w:r>
-      <w:r>
-        <w:br/>
-        <w:t>git commit -m "Add Item ID field"</w:t>
-      </w:r>
-      <w:r>
-        <w:br/>
-        <w:t># add Item UUID</w:t>
-      </w:r>
-      <w:r>
-        <w:br/>
-        <w:t>git add templates/todo.html</w:t>
-      </w:r>
-      <w:r>
-        <w:br/>
-        <w:t>git commit -m "Add Item UUID field"</w:t>
-      </w:r>
-      <w:r>
-        <w:br/>
-        <w:t># add Item Hash</w:t>
-      </w:r>
-      <w:r>
-        <w:br/>
-        <w:t>git add templates/todo.html</w:t>
-      </w:r>
-      <w:r>
-        <w:br/>
-        <w:t>git commit -m "Add Item Hash field"</w:t>
-      </w:r>
-    </w:p>
-    <w:p>
-      <w:r>
-        <w:rPr>
-          <w:b/>
-        </w:rPr>
-        <w:t xml:space="preserve">Explanation: </w:t>
-      </w:r>
-      <w:r>
-        <w:t>Each field must be committed separately so the history contains three individual commits.</w:t>
-      </w:r>
-    </w:p>
-    <w:p>
-      <w:r>
-        <w:rPr>
-          <w:b/>
-        </w:rPr>
-        <w:t xml:space="preserve">Screenshot: </w:t>
-      </w:r>
-      <w:r>
-        <w:t>Paste your genuine terminal / GitHub / browser screenshot here.</w:t>
-      </w:r>
-    </w:p>
-    <w:p>
-      <w:pPr>
-        <w:pStyle w:val="Heading2"/>
-      </w:pPr>
-      <w:r>
-        <w:t>16. Verify sequential commits</w:t>
-      </w:r>
-    </w:p>
-    <w:p>
-      <w:r>
-        <w:rPr>
-          <w:b/>
-        </w:rPr>
-        <w:t>Command / Action:</w:t>
-      </w:r>
-    </w:p>
-    <w:p>
-      <w:pPr>
-        <w:pStyle w:val="NoSpacing"/>
-      </w:pPr>
-      <w:r>
-        <w:t>git log --oneline -5</w:t>
-      </w:r>
-    </w:p>
-    <w:p>
-      <w:r>
-        <w:rPr>
-          <w:b/>
-        </w:rPr>
-        <w:t xml:space="preserve">Explanation: </w:t>
-      </w:r>
-      <w:r>
-        <w:t>Shows the three separate commits in history.</w:t>
-      </w:r>
-    </w:p>
-    <w:p>
-      <w:r>
-        <w:rPr>
-          <w:b/>
-        </w:rPr>
-        <w:t xml:space="preserve">Screenshot: </w:t>
-      </w:r>
-      <w:r>
-        <w:t>Paste your genuine terminal / GitHub / browser screenshot here.</w:t>
-      </w:r>
-    </w:p>
-    <w:p>
-      <w:pPr>
-        <w:pStyle w:val="Heading2"/>
-      </w:pPr>
-      <w:r>
-        <w:t>17. Merge master_1 into main</w:t>
-      </w:r>
-    </w:p>
-    <w:p>
-      <w:r>
-        <w:rPr>
-          <w:b/>
-        </w:rPr>
-        <w:t>Command / Action:</w:t>
-      </w:r>
-    </w:p>
-    <w:p>
-      <w:pPr>
-        <w:pStyle w:val="NoSpacing"/>
-      </w:pPr>
-      <w:r>
-        <w:t>git checkout main</w:t>
-      </w:r>
-      <w:r>
-        <w:br/>
-        <w:t>git merge master_1</w:t>
-      </w:r>
-    </w:p>
-    <w:p>
-      <w:r>
-        <w:rPr>
-          <w:b/>
-        </w:rPr>
-        <w:t xml:space="preserve">Explanation: </w:t>
-      </w:r>
-      <w:r>
-        <w:t>Brings the enhanced To-Do form into main.</w:t>
-      </w:r>
-    </w:p>
-    <w:p>
-      <w:r>
-        <w:rPr>
-          <w:b/>
-        </w:rPr>
         <w:lastRenderedPageBreak/>
-        <w:t xml:space="preserve">Screenshot: </w:t>
-      </w:r>
-      <w:r>
-        <w:t>Paste your genuine terminal / GitHub / browser screenshot here.</w:t>
-      </w:r>
-    </w:p>
-    <w:p>
-      <w:pPr>
-        <w:pStyle w:val="Heading2"/>
-      </w:pPr>
-      <w:r>
         <w:t>18. Soft reset and re-commit</w:t>
       </w:r>
     </w:p>

</xml_diff>